<commit_message>
Record Slice 5 design approval and governance
</commit_message>
<xml_diff>
--- a/docs/Manacondas_Minigame_Mayhem_PRD_v1.1.docx
+++ b/docs/Manacondas_Minigame_Mayhem_PRD_v1.1.docx
@@ -90,6 +90,44 @@
     <w:p>
       <w:r>
         <w:br w:type="page"/>
+      </w:r>
+    </w:p>
+    <w:p>
+      <w:pPr>
+        <w:pStyle w:val="Heading2"/>
+      </w:pPr>
+      <w:r>
+        <w:t>Approved implementation amendment 2.2 - Slice 5 item-system implementation contract</w:t>
+      </w:r>
+    </w:p>
+    <w:p>
+      <w:pPr/>
+      <w:r>
+        <w:t>Approved September 5, 2026 before Slice 5 gameplay implementation. The fifteen-item roster, Sections 15-17 probability matrix, item state machines, ITEM-001 through ITEM-008, AI-004, and existing item values remain unchanged unless this amendment explicitly fills a previously unspecified behavior. The approved implementation and exit contract is recorded in docs/SLICE-5-ITEM-SYSTEM-DESIGN.md and is normative for Slice 5.</w:t>
+      </w:r>
+    </w:p>
+    <w:p>
+      <w:pPr/>
+      <w:r>
+        <w:t>Circuit Alpha uses four rows of eight shared item boxes at approximately 9%, 34%, 62%, and 89% of lap progress. Valid collection locks the weighted result at collection time, roulette presents for approximately 0.85 seconds, and the collected box is globally inactive for approximately 4.5 seconds. Occupied inventory does not consume a box. Mobile gameplay adds a dedicated ITEM control and uses Brake/Reverse plus ITEM for backward-capable deployment, matching the keyboard contract.</w:t>
+      </w:r>
+    </w:p>
+    <w:p>
+      <w:pPr/>
+      <w:r>
+        <w:t>Hyper-Drive Rocket requires position 6-8 and at least 45 meters behind the leader at collection. Invalid prerequisites are filtered before selection and eligible weights renormalize. Initial governed speed-cap targets are Nitro Surge 1.18x, Nitro Overdrive pulse 1.15x, Hyper-Drive Rocket 1.25x on legal spline autopilot, and the existing Prismatic 1.12x.</w:t>
+      </w:r>
+    </w:p>
+    <w:p>
+      <w:pPr/>
+      <w:r>
+        <w:t>Shared effects use the existing standard approximately 0.85-second and heavy approximately 1.20-second spin categories unless the approved Slice 5 design specifies otherwise. Spawned projectiles/hazards have a short owner-immunity arming window; ordinary later self-interaction is permitted after arming.</w:t>
+      </w:r>
+    </w:p>
+    <w:p>
+      <w:pPr/>
+      <w:r>
+        <w:t>Slice 5 keeps definitions and probability data in configuration and separates item selection/lifecycle, boxes, projectiles, hazards, generic racer effects, targeting, Rocket autopilot, AI item policy, and HUD integration. Slice 5 cannot close without the approved probability, interaction, cleanup, performance, deployment, desktop/mobile, and product-owner acceptance evidence. Final production audio/VFX polish remains Slice 6.</w:t>
       </w:r>
     </w:p>
     <w:p>

</xml_diff>

<commit_message>
Record approved Slice 5 item-system design
Record PRD amendment 2.2, ADR-061, the approved Slice 5 item-system design and exit checklist, testing requirements, and current implementation status. Documentation/governance only; no item gameplay code.
</commit_message>
<xml_diff>
--- a/docs/Manacondas_Minigame_Mayhem_PRD_v1.1.docx
+++ b/docs/Manacondas_Minigame_Mayhem_PRD_v1.1.docx
@@ -90,6 +90,44 @@
     <w:p>
       <w:r>
         <w:br w:type="page"/>
+      </w:r>
+    </w:p>
+    <w:p>
+      <w:pPr>
+        <w:pStyle w:val="Heading2"/>
+      </w:pPr>
+      <w:r>
+        <w:t>Approved implementation amendment 2.2 - Slice 5 item-system implementation contract</w:t>
+      </w:r>
+    </w:p>
+    <w:p>
+      <w:pPr/>
+      <w:r>
+        <w:t>Approved September 5, 2026 before Slice 5 gameplay implementation. The fifteen-item roster, Sections 15-17 probability matrix, item state machines, ITEM-001 through ITEM-008, AI-004, and existing item values remain unchanged unless this amendment explicitly fills a previously unspecified behavior. The approved implementation and exit contract is recorded in docs/SLICE-5-ITEM-SYSTEM-DESIGN.md and is normative for Slice 5.</w:t>
+      </w:r>
+    </w:p>
+    <w:p>
+      <w:pPr/>
+      <w:r>
+        <w:t>Circuit Alpha uses four rows of eight shared item boxes at approximately 9%, 34%, 62%, and 89% of lap progress. Valid collection locks the weighted result at collection time, roulette presents for approximately 0.85 seconds, and the collected box is globally inactive for approximately 4.5 seconds. Occupied inventory does not consume a box. Mobile gameplay adds a dedicated ITEM control and uses Brake/Reverse plus ITEM for backward-capable deployment, matching the keyboard contract.</w:t>
+      </w:r>
+    </w:p>
+    <w:p>
+      <w:pPr/>
+      <w:r>
+        <w:t>Hyper-Drive Rocket requires position 6-8 and at least 45 meters behind the leader at collection. Invalid prerequisites are filtered before selection and eligible weights renormalize. Initial governed speed-cap targets are Nitro Surge 1.18x, Nitro Overdrive pulse 1.15x, Hyper-Drive Rocket 1.25x on legal spline autopilot, and the existing Prismatic 1.12x.</w:t>
+      </w:r>
+    </w:p>
+    <w:p>
+      <w:pPr/>
+      <w:r>
+        <w:t>Shared effects use the existing standard approximately 0.85-second and heavy approximately 1.20-second spin categories unless the approved Slice 5 design specifies otherwise. Spawned projectiles/hazards have a short owner-immunity arming window; ordinary later self-interaction is permitted after arming.</w:t>
+      </w:r>
+    </w:p>
+    <w:p>
+      <w:pPr/>
+      <w:r>
+        <w:t>Slice 5 keeps definitions and probability data in configuration and separates item selection/lifecycle, boxes, projectiles, hazards, generic racer effects, targeting, Rocket autopilot, AI item policy, and HUD integration. Slice 5 cannot close without the approved probability, interaction, cleanup, performance, deployment, desktop/mobile, and product-owner acceptance evidence. Final production audio/VFX polish remains Slice 6.</w:t>
       </w:r>
     </w:p>
     <w:p>

</xml_diff>